<commit_message>
Give each student a signature row in the report
</commit_message>
<xml_diff>
--- a/report/Mini Project Report - Rotten Tomatoes Gap.docx
+++ b/report/Mini Project Report - Rotten Tomatoes Gap.docx
@@ -1385,17 +1385,27 @@
         </w:tc>
       </w:tr>
       <w:tr>
+        <w:trPr>
+          <w:trHeight w:val="720" w:hRule="atLeast"/>
+        </w:trPr>
         <w:tc>
           <w:tcPr>
             <w:tcW w:w="3405" w:type="dxa"/>
           </w:tcPr>
           <w:p>
             <w:pPr/>
+            <w:r>
+              <w:rPr>
+                <w:sz w:val="18"/>
+              </w:rPr>
+              <w:t xml:space="preserve">Anushka Sinha (245816322)</w:t>
+            </w:r>
           </w:p>
         </w:tc>
         <w:tc>
           <w:tcPr>
             <w:tcW w:w="3077" w:type="dxa"/>
+            <w:vMerge w:val="restart"/>
           </w:tcPr>
           <w:p>
             <w:pPr/>
@@ -1404,6 +1414,44 @@
         <w:tc>
           <w:tcPr>
             <w:tcW w:w="2877" w:type="dxa"/>
+            <w:vMerge w:val="restart"/>
+          </w:tcPr>
+          <w:p>
+            <w:pPr/>
+          </w:p>
+        </w:tc>
+      </w:tr>
+      <w:tr>
+        <w:trPr>
+          <w:trHeight w:val="720" w:hRule="atLeast"/>
+        </w:trPr>
+        <w:tc>
+          <w:tcPr>
+            <w:tcW w:w="3405" w:type="dxa"/>
+          </w:tcPr>
+          <w:p>
+            <w:pPr/>
+            <w:r>
+              <w:rPr>
+                <w:sz w:val="18"/>
+              </w:rPr>
+              <w:t xml:space="preserve">Aahna Negi (245816190)</w:t>
+            </w:r>
+          </w:p>
+        </w:tc>
+        <w:tc>
+          <w:tcPr>
+            <w:tcW w:w="3077" w:type="dxa"/>
+            <w:vMerge/>
+          </w:tcPr>
+          <w:p>
+            <w:pPr/>
+          </w:p>
+        </w:tc>
+        <w:tc>
+          <w:tcPr>
+            <w:tcW w:w="2877" w:type="dxa"/>
+            <w:vMerge/>
           </w:tcPr>
           <w:p>
             <w:pPr/>

</xml_diff>